<commit_message>
Fixed export UI and added 2 new templates
</commit_message>
<xml_diff>
--- a/server/app/static/templates/modern.docx
+++ b/server/app/static/templates/modern.docx
@@ -1,100 +1,541 @@
 
 <file path=word/document.xml><?xml version="1.0" encoding="utf-8"?>
-<w:document xmlns:wpc="http://schemas.microsoft.com/office/word/2010/wordprocessingCanvas" xmlns:mo="http://schemas.microsoft.com/office/mac/office/2008/main" xmlns:mc="http://schemas.openxmlformats.org/markup-compatibility/2006" xmlns:mv="urn:schemas-microsoft-com:mac:vml" xmlns:o="urn:schemas-microsoft-com:office:office" xmlns:r="http://schemas.openxmlformats.org/officeDocument/2006/relationships" xmlns:m="http://schemas.openxmlformats.org/officeDocument/2006/math" xmlns:v="urn:schemas-microsoft-com:vml" xmlns:wp14="http://schemas.microsoft.com/office/word/2010/wordprocessingDrawing" xmlns:wp="http://schemas.openxmlformats.org/drawingml/2006/wordprocessingDrawing" xmlns:w10="urn:schemas-microsoft-com:office:word" xmlns:w="http://schemas.openxmlformats.org/wordprocessingml/2006/main" xmlns:w14="http://schemas.microsoft.com/office/word/2010/wordml" xmlns:wpg="http://schemas.microsoft.com/office/word/2010/wordprocessingGroup" xmlns:wpi="http://schemas.microsoft.com/office/word/2010/wordprocessingInk" xmlns:wne="http://schemas.microsoft.com/office/word/2006/wordml" xmlns:wps="http://schemas.microsoft.com/office/word/2010/wordprocessingShape" mc:Ignorable="w14 wp14">
+<w:document xmlns:mc="http://schemas.openxmlformats.org/markup-compatibility/2006" xmlns:o="urn:schemas-microsoft-com:office:office" xmlns:r="http://schemas.openxmlformats.org/officeDocument/2006/relationships" xmlns:m="http://schemas.openxmlformats.org/officeDocument/2006/math" xmlns:v="urn:schemas-microsoft-com:vml" xmlns:wp="http://schemas.openxmlformats.org/drawingml/2006/wordprocessingDrawing" xmlns:w10="urn:schemas-microsoft-com:office:word" xmlns:w="http://schemas.openxmlformats.org/wordprocessingml/2006/main" xmlns:w14="http://schemas.microsoft.com/office/word/2010/wordml" xmlns:wne="http://schemas.microsoft.com/office/word/2006/wordml" mc:Ignorable="w14">
   <w:body>
-    <w:p>
-      <w:pPr>
-        <w:pStyle w:val="Title"/>
-      </w:pPr>
-      <w:r>
-        <w:t>{{ name }}</w:t>
-      </w:r>
-    </w:p>
-    <w:p>
-      <w:r>
-        <w:t>{{ email }} | {{ phone }} | {{ location }}</w:t>
-      </w:r>
-    </w:p>
-    <w:p>
-      <w:pPr>
-        <w:pStyle w:val="Heading1"/>
-      </w:pPr>
-      <w:r>
-        <w:t>Summary</w:t>
-      </w:r>
-    </w:p>
-    <w:p>
-      <w:r>
-        <w:t>{{ summary }}</w:t>
-      </w:r>
-    </w:p>
-    <w:p>
-      <w:pPr>
-        <w:pStyle w:val="Heading1"/>
-      </w:pPr>
-      <w:r>
-        <w:t>Professional Experience</w:t>
-      </w:r>
-    </w:p>
-    <w:p>
-      <w:r>
-        <w:t>{% for item in experience %}</w:t>
-      </w:r>
-    </w:p>
-    <w:p>
-      <w:pPr>
-        <w:pStyle w:val="Heading2"/>
-      </w:pPr>
-      <w:r>
-        <w:t>{{ item.role }} @ {{ item.company }}</w:t>
-      </w:r>
-    </w:p>
-    <w:p>
-      <w:r>
-        <w:t>{% if item.start_date or item.end_date %}{{ item.start_date }}{% if item.start_date and item.end_date %} - {% endif %}{{ item.end_date }}{% endif %}</w:t>
-      </w:r>
-    </w:p>
-    <w:p>
-      <w:r>
-        <w:t>{% for bullet in item.bullets %}</w:t>
-      </w:r>
-    </w:p>
-    <w:p>
-      <w:pPr>
-        <w:pStyle w:val="ListBullet"/>
-      </w:pPr>
-      <w:r>
-        <w:t>• {{ bullet }}</w:t>
-      </w:r>
-    </w:p>
-    <w:p>
-      <w:r>
-        <w:t>{% endfor %}</w:t>
-      </w:r>
-    </w:p>
-    <w:p>
-      <w:r>
-        <w:t>{% endfor %}</w:t>
-      </w:r>
-    </w:p>
-    <w:p>
-      <w:pPr>
-        <w:pStyle w:val="Heading1"/>
-      </w:pPr>
-      <w:r>
-        <w:t>Skills</w:t>
-      </w:r>
-    </w:p>
-    <w:p>
-      <w:r>
-        <w:t>{{ skills|join(", ") }}</w:t>
-      </w:r>
-    </w:p>
+    <w:tbl>
+      <w:tblPr>
+        <w:tblW w:w="11520" w:type="dxa"/>
+        <w:tblBorders>
+          <w:top w:val="none" w:sz="0" w:space="0" w:color="auto"/>
+          <w:left w:val="none" w:sz="0" w:space="0" w:color="auto"/>
+          <w:bottom w:val="none" w:sz="0" w:space="0" w:color="auto"/>
+          <w:right w:val="none" w:sz="0" w:space="0" w:color="auto"/>
+          <w:insideH w:val="none" w:sz="0" w:space="0" w:color="auto"/>
+          <w:insideV w:val="none" w:sz="0" w:space="0" w:color="auto"/>
+        </w:tblBorders>
+        <w:tblLayout w:type="fixed"/>
+        <w:tblCellMar>
+          <w:top w:w="0" w:type="dxa"/>
+          <w:left w:w="0" w:type="dxa"/>
+          <w:bottom w:w="0" w:type="dxa"/>
+          <w:right w:w="0" w:type="dxa"/>
+        </w:tblCellMar>
+      </w:tblPr>
+      <w:tblGrid>
+        <w:gridCol w:w="3200"/>
+        <w:gridCol w:w="8320"/>
+      </w:tblGrid>
+      <w:tr>
+        <w:trPr>
+          <w:cantSplit/>
+        </w:trPr>
+        <w:tc>
+          <w:tcPr>
+            <w:tcW w:w="3200" w:type="dxa"/>
+            <w:shd w:val="clear" w:color="auto" w:fill="E8F5F3"/>
+            <w:tcBorders>
+              <w:top w:val="none" w:sz="0" w:space="0" w:color="auto"/>
+              <w:left w:val="none" w:sz="0" w:space="0" w:color="auto"/>
+              <w:bottom w:val="none" w:sz="0" w:space="0" w:color="auto"/>
+              <w:right w:val="none" w:sz="0" w:space="0" w:color="auto"/>
+              <w:insideH w:val="none" w:sz="0" w:space="0" w:color="auto"/>
+              <w:insideV w:val="none" w:sz="0" w:space="0" w:color="auto"/>
+            </w:tcBorders>
+            <w:tcMar>
+              <w:top w:w="560" w:type="dxa"/>
+              <w:left w:w="280" w:type="dxa"/>
+              <w:bottom w:w="360" w:type="dxa"/>
+              <w:right w:w="200" w:type="dxa"/>
+            </w:tcMar>
+          </w:tcPr>
+          <w:p>
+            <w:pPr>
+              <w:spacing w:before="0" w:after="20" w:line="240" w:lineRule="auto"/>
+            </w:pPr>
+            <w:r>
+              <w:rPr>
+                <w:rFonts w:ascii="Calibri" w:hAnsi="Calibri" w:cs="Calibri"/>
+                <w:sz w:val="48"/>
+                <w:szCs w:val="48"/>
+                <w:color w:val="0F7B6C"/>
+                <w:b/>
+                <w:bCs/>
+              </w:rPr>
+              <w:t xml:space="preserve">{{ full_name }}</w:t>
+            </w:r>
+          </w:p>
+          <w:p>
+            <w:pPr>
+              <w:spacing w:before="0" w:after="40" w:line="240" w:lineRule="auto"/>
+            </w:pPr>
+            <w:r>
+              <w:rPr>
+                <w:rFonts w:ascii="Calibri" w:hAnsi="Calibri" w:cs="Calibri"/>
+                <w:sz w:val="18"/>
+                <w:szCs w:val="18"/>
+                <w:color w:val="5F6368"/>
+                <w:i/>
+                <w:iCs/>
+              </w:rPr>
+              <w:t xml:space="preserve">Java Software Engineer</w:t>
+            </w:r>
+          </w:p>
+          <w:p>
+            <w:pPr>
+              <w:spacing w:before="200" w:after="60" w:line="240" w:lineRule="auto"/>
+              <w:pBdr>
+                <w:bottom w:val="single" w:sz="6" w:space="4" w:color="0F7B6C"/>
+              </w:pBdr>
+            </w:pPr>
+            <w:r>
+              <w:rPr>
+                <w:rFonts w:ascii="Calibri" w:hAnsi="Calibri" w:cs="Calibri"/>
+                <w:sz w:val="18"/>
+                <w:szCs w:val="18"/>
+                <w:color w:val="0F7B6C"/>
+                <w:b/>
+                <w:bCs/>
+              </w:rPr>
+              <w:t>CONTACT</w:t>
+            </w:r>
+          </w:p>
+          <w:p>
+            <w:pPr>
+              <w:spacing w:before="20" w:after="20" w:line="240" w:lineRule="auto"/>
+            </w:pPr>
+            <w:r>
+              <w:rPr>
+                <w:rFonts w:ascii="Calibri" w:hAnsi="Calibri" w:cs="Calibri"/>
+                <w:sz w:val="18"/>
+                <w:szCs w:val="18"/>
+                <w:color w:val="0F7B6C"/>
+              </w:rPr>
+              <w:t xml:space="preserve">☎  </w:t>
+            </w:r>
+            <w:r>
+              <w:rPr>
+                <w:rFonts w:ascii="Calibri" w:hAnsi="Calibri" w:cs="Calibri"/>
+                <w:sz w:val="18"/>
+                <w:szCs w:val="18"/>
+                <w:color w:val="1A1A1A"/>
+              </w:rPr>
+              <w:t xml:space="preserve">{{ phone }}</w:t>
+            </w:r>
+          </w:p>
+          <w:p>
+            <w:pPr>
+              <w:spacing w:before="20" w:after="20" w:line="240" w:lineRule="auto"/>
+            </w:pPr>
+            <w:r>
+              <w:rPr>
+                <w:rFonts w:ascii="Calibri" w:hAnsi="Calibri" w:cs="Calibri"/>
+                <w:sz w:val="18"/>
+                <w:szCs w:val="18"/>
+                <w:color w:val="0F7B6C"/>
+              </w:rPr>
+              <w:t xml:space="preserve">✉  </w:t>
+            </w:r>
+            <w:r>
+              <w:rPr>
+                <w:rFonts w:ascii="Calibri" w:hAnsi="Calibri" w:cs="Calibri"/>
+                <w:sz w:val="18"/>
+                <w:szCs w:val="18"/>
+                <w:color w:val="1A1A1A"/>
+              </w:rPr>
+              <w:t xml:space="preserve">{{ email }}</w:t>
+            </w:r>
+          </w:p>
+          <w:p>
+            <w:pPr>
+              <w:spacing w:before="20" w:after="20" w:line="240" w:lineRule="auto"/>
+            </w:pPr>
+            <w:r>
+              <w:rPr>
+                <w:rFonts w:ascii="Calibri" w:hAnsi="Calibri" w:cs="Calibri"/>
+                <w:sz w:val="20"/>
+                <w:szCs w:val="20"/>
+                <w:color w:val="1A1A1A"/>
+              </w:rPr>
+              <w:t xml:space="preserve">{% for link in links %}</w:t>
+            </w:r>
+            <w:r>
+              <w:rPr>
+                <w:rFonts w:ascii="Calibri" w:hAnsi="Calibri" w:cs="Calibri"/>
+                <w:sz w:val="18"/>
+                <w:szCs w:val="18"/>
+                <w:color w:val="0F7B6C"/>
+              </w:rPr>
+              <w:t xml:space="preserve">▸  </w:t>
+            </w:r>
+            <w:r>
+              <w:rPr>
+                <w:rFonts w:ascii="Calibri" w:hAnsi="Calibri" w:cs="Calibri"/>
+                <w:sz w:val="18"/>
+                <w:szCs w:val="18"/>
+                <w:color w:val="1A1A1A"/>
+              </w:rPr>
+              <w:t xml:space="preserve">{{ link }}</w:t>
+            </w:r>
+            <w:r>
+              <w:rPr>
+                <w:rFonts w:ascii="Calibri" w:hAnsi="Calibri" w:cs="Calibri"/>
+                <w:sz w:val="20"/>
+                <w:szCs w:val="20"/>
+                <w:color w:val="1A1A1A"/>
+              </w:rPr>
+              <w:t xml:space="preserve">{% if not loop.last %}</w:t>
+            </w:r>
+            <w:r>
+              <w:rPr>
+                <w:rFonts w:ascii="Calibri" w:hAnsi="Calibri" w:cs="Calibri"/>
+                <w:sz w:val="18"/>
+                <w:szCs w:val="18"/>
+                <w:color w:val="1A1A1A"/>
+              </w:rPr>
+              <w:t xml:space="preserve"/>
+            </w:r>
+            <w:r>
+              <w:rPr>
+                <w:rFonts w:ascii="Calibri" w:hAnsi="Calibri" w:cs="Calibri"/>
+                <w:sz w:val="20"/>
+                <w:szCs w:val="20"/>
+                <w:color w:val="1A1A1A"/>
+              </w:rPr>
+              <w:t xml:space="preserve">{% endif %}{% endfor %}</w:t>
+            </w:r>
+          </w:p>
+          <w:p>
+            <w:pPr>
+              <w:spacing w:before="200" w:after="60" w:line="240" w:lineRule="auto"/>
+              <w:pBdr>
+                <w:bottom w:val="single" w:sz="6" w:space="4" w:color="0F7B6C"/>
+              </w:pBdr>
+            </w:pPr>
+            <w:r>
+              <w:rPr>
+                <w:rFonts w:ascii="Calibri" w:hAnsi="Calibri" w:cs="Calibri"/>
+                <w:sz w:val="18"/>
+                <w:szCs w:val="18"/>
+                <w:color w:val="0F7B6C"/>
+                <w:b/>
+                <w:bCs/>
+              </w:rPr>
+              <w:t>SKILLS</w:t>
+            </w:r>
+          </w:p>
+          <w:p>
+            <w:pPr>
+              <w:spacing w:before="20" w:after="20" w:line="320" w:lineRule="auto"/>
+            </w:pPr>
+            <w:r>
+              <w:rPr>
+                <w:rFonts w:ascii="Calibri" w:hAnsi="Calibri" w:cs="Calibri"/>
+                <w:sz w:val="20"/>
+                <w:szCs w:val="20"/>
+                <w:color w:val="1A1A1A"/>
+              </w:rPr>
+              <w:t xml:space="preserve">{% for skill in skills %}</w:t>
+            </w:r>
+            <w:r>
+              <w:rPr>
+                <w:rFonts w:ascii="Calibri" w:hAnsi="Calibri" w:cs="Calibri"/>
+                <w:sz w:val="18"/>
+                <w:szCs w:val="18"/>
+                <w:color w:val="0F7B6C"/>
+              </w:rPr>
+              <w:t xml:space="preserve">• </w:t>
+            </w:r>
+            <w:r>
+              <w:rPr>
+                <w:rFonts w:ascii="Calibri" w:hAnsi="Calibri" w:cs="Calibri"/>
+                <w:sz w:val="18"/>
+                <w:szCs w:val="18"/>
+                <w:color w:val="1A1A1A"/>
+              </w:rPr>
+              <w:t xml:space="preserve">{{ skill }}</w:t>
+            </w:r>
+            <w:r>
+              <w:rPr>
+                <w:rFonts w:ascii="Calibri" w:hAnsi="Calibri" w:cs="Calibri"/>
+                <w:sz w:val="18"/>
+                <w:szCs w:val="18"/>
+                <w:color w:val="1A1A1A"/>
+              </w:rPr>
+              <w:t xml:space="preserve">  </w:t>
+            </w:r>
+            <w:r>
+              <w:rPr>
+                <w:rFonts w:ascii="Calibri" w:hAnsi="Calibri" w:cs="Calibri"/>
+                <w:sz w:val="20"/>
+                <w:szCs w:val="20"/>
+                <w:color w:val="1A1A1A"/>
+              </w:rPr>
+              <w:t xml:space="preserve">{% endfor %}</w:t>
+            </w:r>
+          </w:p>
+        </w:tc>
+        <w:tc>
+          <w:tcPr>
+            <w:tcW w:w="8320" w:type="dxa"/>
+            <w:tcBorders>
+              <w:top w:val="none" w:sz="0" w:space="0" w:color="auto"/>
+              <w:left w:val="none" w:sz="0" w:space="0" w:color="auto"/>
+              <w:bottom w:val="none" w:sz="0" w:space="0" w:color="auto"/>
+              <w:right w:val="none" w:sz="0" w:space="0" w:color="auto"/>
+              <w:insideH w:val="none" w:sz="0" w:space="0" w:color="auto"/>
+              <w:insideV w:val="none" w:sz="0" w:space="0" w:color="auto"/>
+            </w:tcBorders>
+            <w:tcMar>
+              <w:top w:w="560" w:type="dxa"/>
+              <w:left w:w="400" w:type="dxa"/>
+              <w:bottom w:w="360" w:type="dxa"/>
+              <w:right w:w="360" w:type="dxa"/>
+            </w:tcMar>
+          </w:tcPr>
+          <w:p>
+            <w:pPr>
+              <w:spacing w:before="140" w:after="60" w:line="240" w:lineRule="auto"/>
+              <w:shd w:val="clear" w:color="auto" w:fill="0F7B6C"/>
+            </w:pPr>
+            <w:r>
+              <w:rPr>
+                <w:rFonts w:ascii="Calibri" w:hAnsi="Calibri" w:cs="Calibri"/>
+                <w:sz w:val="20"/>
+                <w:szCs w:val="20"/>
+                <w:color w:val="FFFFFF"/>
+                <w:b/>
+                <w:bCs/>
+              </w:rPr>
+              <w:t xml:space="preserve">  PROFESSIONAL SUMMARY</w:t>
+            </w:r>
+          </w:p>
+          <w:p>
+            <w:pPr>
+              <w:spacing w:before="50" w:after="50" w:line="240" w:lineRule="auto"/>
+            </w:pPr>
+            <w:r>
+              <w:rPr>
+                <w:rFonts w:ascii="Calibri" w:hAnsi="Calibri" w:cs="Calibri"/>
+                <w:sz w:val="20"/>
+                <w:szCs w:val="20"/>
+                <w:color w:val="1A1A1A"/>
+              </w:rPr>
+              <w:t xml:space="preserve">{{ summary }}</w:t>
+            </w:r>
+          </w:p>
+          <w:p>
+            <w:pPr>
+              <w:spacing w:before="140" w:after="60" w:line="240" w:lineRule="auto"/>
+              <w:shd w:val="clear" w:color="auto" w:fill="0F7B6C"/>
+            </w:pPr>
+            <w:r>
+              <w:rPr>
+                <w:rFonts w:ascii="Calibri" w:hAnsi="Calibri" w:cs="Calibri"/>
+                <w:sz w:val="20"/>
+                <w:szCs w:val="20"/>
+                <w:color w:val="FFFFFF"/>
+                <w:b/>
+                <w:bCs/>
+              </w:rPr>
+              <w:t xml:space="preserve">  EXPERIENCE</w:t>
+            </w:r>
+          </w:p>
+          <w:p>
+            <w:pPr>
+              <w:spacing w:before="0" w:after="0" w:line="240" w:lineRule="auto"/>
+            </w:pPr>
+            <w:r>
+              <w:rPr>
+                <w:rFonts w:ascii="Calibri" w:hAnsi="Calibri" w:cs="Calibri"/>
+                <w:sz w:val="20"/>
+                <w:szCs w:val="20"/>
+                <w:color w:val="1A1A1A"/>
+              </w:rPr>
+              <w:t xml:space="preserve">{% for item in experience %}</w:t>
+            </w:r>
+          </w:p>
+          <w:p>
+            <w:pPr>
+              <w:spacing w:before="120" w:after="0" w:line="240" w:lineRule="auto"/>
+            </w:pPr>
+            <w:r>
+              <w:rPr>
+                <w:rFonts w:ascii="Calibri" w:hAnsi="Calibri" w:cs="Calibri"/>
+                <w:sz w:val="20"/>
+                <w:szCs w:val="20"/>
+                <w:color w:val="0F7B6C"/>
+                <w:b/>
+                <w:bCs/>
+              </w:rPr>
+              <w:t xml:space="preserve">{{ item.company }}</w:t>
+            </w:r>
+          </w:p>
+          <w:p>
+            <w:pPr>
+              <w:spacing w:before="0" w:after="4" w:line="240" w:lineRule="auto"/>
+              <w:tabs>
+                <w:tab w:val="right" w:pos="7800"/>
+              </w:tabs>
+            </w:pPr>
+            <w:r>
+              <w:rPr>
+                <w:rFonts w:ascii="Calibri" w:hAnsi="Calibri" w:cs="Calibri"/>
+                <w:sz w:val="20"/>
+                <w:szCs w:val="20"/>
+                <w:color w:val="3D3D3D"/>
+                <w:i/>
+                <w:iCs/>
+              </w:rPr>
+              <w:t xml:space="preserve">{{ item.role }}</w:t>
+            </w:r>
+            <w:r>
+              <w:rPr>
+                <w:rFonts w:ascii="Calibri" w:hAnsi="Calibri" w:cs="Calibri"/>
+              </w:rPr>
+              <w:tab/>
+            </w:r>
+            <w:r>
+              <w:rPr>
+                <w:rFonts w:ascii="Calibri" w:hAnsi="Calibri" w:cs="Calibri"/>
+                <w:sz w:val="18"/>
+                <w:szCs w:val="18"/>
+                <w:color w:val="5F6368"/>
+              </w:rPr>
+              <w:t xml:space="preserve">{{ item.start_date }}{% if item.start_date and item.end_date %} – {% endif %}{{ item.end_date }}</w:t>
+            </w:r>
+          </w:p>
+          <w:p>
+            <w:pPr>
+              <w:spacing w:before="0" w:after="20" w:line="240" w:lineRule="auto"/>
+            </w:pPr>
+            <w:r>
+              <w:rPr>
+                <w:rFonts w:ascii="Calibri" w:hAnsi="Calibri" w:cs="Calibri"/>
+                <w:sz w:val="18"/>
+                <w:szCs w:val="18"/>
+                <w:color w:val="0F7B6C"/>
+              </w:rPr>
+              <w:t xml:space="preserve">▾  </w:t>
+            </w:r>
+            <w:r>
+              <w:rPr>
+                <w:rFonts w:ascii="Calibri" w:hAnsi="Calibri" w:cs="Calibri"/>
+                <w:sz w:val="18"/>
+                <w:szCs w:val="18"/>
+                <w:color w:val="909090"/>
+                <w:i/>
+                <w:iCs/>
+              </w:rPr>
+              <w:t xml:space="preserve">{{ item.location }}</w:t>
+            </w:r>
+          </w:p>
+          <w:p>
+            <w:pPr>
+              <w:spacing w:before="0" w:after="20" w:line="240" w:lineRule="auto"/>
+            </w:pPr>
+            <w:r>
+              <w:rPr>
+                <w:rFonts w:ascii="Calibri" w:hAnsi="Calibri" w:cs="Calibri"/>
+                <w:sz w:val="20"/>
+                <w:szCs w:val="20"/>
+                <w:color w:val="1A1A1A"/>
+              </w:rPr>
+              <w:t xml:space="preserve">{% if item.context %}</w:t>
+            </w:r>
+            <w:r>
+              <w:rPr>
+                <w:rFonts w:ascii="Calibri" w:hAnsi="Calibri" w:cs="Calibri"/>
+                <w:sz w:val="18"/>
+                <w:szCs w:val="18"/>
+                <w:color w:val="909090"/>
+                <w:i/>
+                <w:iCs/>
+              </w:rPr>
+              <w:t xml:space="preserve">{{ item.context }}</w:t>
+            </w:r>
+            <w:r>
+              <w:rPr>
+                <w:rFonts w:ascii="Calibri" w:hAnsi="Calibri" w:cs="Calibri"/>
+                <w:sz w:val="20"/>
+                <w:szCs w:val="20"/>
+                <w:color w:val="1A1A1A"/>
+              </w:rPr>
+              <w:t xml:space="preserve">{% endif %}</w:t>
+            </w:r>
+          </w:p>
+          <w:p>
+            <w:pPr>
+              <w:spacing w:before="0" w:after="0" w:line="240" w:lineRule="auto"/>
+            </w:pPr>
+            <w:r>
+              <w:rPr>
+                <w:rFonts w:ascii="Calibri" w:hAnsi="Calibri" w:cs="Calibri"/>
+                <w:sz w:val="20"/>
+                <w:szCs w:val="20"/>
+                <w:color w:val="1A1A1A"/>
+              </w:rPr>
+              <w:t xml:space="preserve">{% for bullet in item.bullets %}</w:t>
+            </w:r>
+          </w:p>
+          <w:p>
+            <w:pPr>
+              <w:spacing w:before="28" w:after="28" w:line="240" w:lineRule="auto"/>
+              <w:contextualSpacing/>
+              <w:ind w:left="320" w:hanging="220"/>
+            </w:pPr>
+            <w:r>
+              <w:rPr>
+                <w:rFonts w:ascii="Calibri" w:hAnsi="Calibri" w:cs="Calibri"/>
+                <w:sz w:val="20"/>
+                <w:szCs w:val="20"/>
+                <w:color w:val="0F7B6C"/>
+              </w:rPr>
+              <w:t xml:space="preserve">—  </w:t>
+            </w:r>
+            <w:r>
+              <w:rPr>
+                <w:rFonts w:ascii="Calibri" w:hAnsi="Calibri" w:cs="Calibri"/>
+                <w:sz w:val="20"/>
+                <w:szCs w:val="20"/>
+                <w:color w:val="1A1A1A"/>
+              </w:rPr>
+              <w:t xml:space="preserve">{{ bullet }}</w:t>
+            </w:r>
+          </w:p>
+          <w:p>
+            <w:pPr>
+              <w:spacing w:before="0" w:after="0" w:line="240" w:lineRule="auto"/>
+            </w:pPr>
+            <w:r>
+              <w:rPr>
+                <w:rFonts w:ascii="Calibri" w:hAnsi="Calibri" w:cs="Calibri"/>
+                <w:sz w:val="20"/>
+                <w:szCs w:val="20"/>
+                <w:color w:val="1A1A1A"/>
+              </w:rPr>
+              <w:t xml:space="preserve">{% endfor %}</w:t>
+            </w:r>
+          </w:p>
+          <w:p>
+            <w:pPr>
+              <w:spacing w:before="0" w:after="0" w:line="240" w:lineRule="auto"/>
+            </w:pPr>
+            <w:r>
+              <w:rPr>
+                <w:rFonts w:ascii="Calibri" w:hAnsi="Calibri" w:cs="Calibri"/>
+                <w:sz w:val="20"/>
+                <w:szCs w:val="20"/>
+                <w:color w:val="1A1A1A"/>
+              </w:rPr>
+              <w:t xml:space="preserve">{% endfor %}</w:t>
+            </w:r>
+          </w:p>
+        </w:tc>
+      </w:tr>
+    </w:tbl>
     <w:sectPr>
       <w:pgSz w:w="12240" w:h="15840"/>
-      <w:pgMar w:top="1440" w:right="1800" w:bottom="1440" w:left="1800" w:header="720" w:footer="720" w:gutter="0"/>
-      <w:cols w:space="720"/>
-      <w:docGrid w:linePitch="360"/>
+      <w:pgMar w:top="0" w:right="720" w:bottom="720" w:left="0" w:header="0" w:footer="0" w:gutter="0"/>
     </w:sectPr>
   </w:body>
 </w:document>

</xml_diff>

<commit_message>
Refactor Ingestion and Review Steps for Improved UX and Code Consistency
</commit_message>
<xml_diff>
--- a/server/app/static/templates/modern.docx
+++ b/server/app/static/templates/modern.docx
@@ -26,9 +26,7 @@
         <w:gridCol w:w="8320"/>
       </w:tblGrid>
       <w:tr>
-        <w:trPr>
-          <w:cantSplit/>
-        </w:trPr>
+        <w:trPr/>
         <w:tc>
           <w:tcPr>
             <w:tcW w:w="3200" w:type="dxa"/>

</xml_diff>